<commit_message>
Slides: chaves artificiais (PK/FK) nos esquemas estrela
Cada dimensão mostra a PK sk_*; o fato mostra as FKs à esquerda e a dimensão
degenerada e as medidas à direita. Estrelas ocupam a largura do slide.
Roteiro da Parte 2 explica a legenda.

Co-Authored-By: Claude Opus 5.5 <noreply@anthropic.com>
</commit_message>
<xml_diff>
--- a/apresentacao/roteiros/Parte 2 - Processos e estrelas.docx
+++ b/apresentacao/roteiros/Parte 2 - Processos e estrelas.docx
@@ -615,7 +615,57 @@
       </w:r>
       <w:r>
         <w:rPr/>
-        <w:t xml:space="preserve"> com três dimensões (tempo, tipo de equipe, estabelecimento).</w:t>
+        <w:t xml:space="preserve"> com três dimensões (tempo, tipo de equipe, estabelecimento). Em cada dimensão, a primeira linha é a chave artificial (</w:t>
+      </w:r>
+      <w:r>
+        <w:rPr>
+          <w:b/>
+        </w:rPr>
+        <w:t>PK</w:t>
+      </w:r>
+      <w:r>
+        <w:rPr/>
+        <w:t xml:space="preserve"> </w:t>
+      </w:r>
+      <w:r>
+        <w:rPr>
+          <w:rFonts w:ascii="Liberation Mono" w:hAnsi="Liberation Mono"/>
+        </w:rPr>
+        <w:t>sk_*</w:t>
+      </w:r>
+      <w:r>
+        <w:rPr/>
+        <w:t>); no fato, à esquerda, as chaves estrangeiras (</w:t>
+      </w:r>
+      <w:r>
+        <w:rPr>
+          <w:b/>
+        </w:rPr>
+        <w:t>FK</w:t>
+      </w:r>
+      <w:r>
+        <w:rPr/>
+        <w:t>) para cada dimensão e, à direita, a dimensão degenerada (</w:t>
+      </w:r>
+      <w:r>
+        <w:rPr>
+          <w:b/>
+        </w:rPr>
+        <w:t>DD</w:t>
+      </w:r>
+      <w:r>
+        <w:rPr/>
+        <w:t>) e as medidas (</w:t>
+      </w:r>
+      <w:r>
+        <w:rPr>
+          <w:b/>
+        </w:rPr>
+        <w:t>M</w:t>
+      </w:r>
+      <w:r>
+        <w:rPr/>
+        <w:t>). As três estrelas seguem a mesma legenda.</w:t>
       </w:r>
     </w:p>
     <w:p>
@@ -685,7 +735,17 @@
       </w:r>
       <w:r>
         <w:rPr/>
-        <w:t>. O identificador da equipe (</w:t>
+        <w:t xml:space="preserve">. A chave primária do fato é a combinação das FKs com a dimensão degenerada. As chaves </w:t>
+      </w:r>
+      <w:r>
+        <w:rPr>
+          <w:rFonts w:ascii="Liberation Mono" w:hAnsi="Liberation Mono"/>
+        </w:rPr>
+        <w:t>sk_*</w:t>
+      </w:r>
+      <w:r>
+        <w:rPr/>
+        <w:t xml:space="preserve"> são artificiais: inteiros gerados na carga, independentes dos códigos das fontes, com o valor 0 reservado para “Não informado”. O identificador da equipe (</w:t>
       </w:r>
       <w:r>
         <w:rPr>

</xml_diff>